<commit_message>
fix: use dedicated Cloud Build identity
</commit_message>
<xml_diff>
--- a/project-notes/word/DCKA_網站與AI助教技術架構_安全強化版.docx
+++ b/project-notes/word/DCKA_網站與AI助教技術架構_安全強化版.docx
@@ -1046,7 +1046,7 @@
                 <w:color w:val="111827"/>
                 <w:sz w:val="18"/>
               </w:rPr>
-              <w:t>依 Dockerfile 建置並保存可部署 container image</w:t>
+              <w:t>以 dcka-cloud-build（run.builder）建置並保存 container image</w:t>
             </w:r>
           </w:p>
         </w:tc>
@@ -1976,7 +1976,7 @@
       <w:r>
         <w:drawing>
           <wp:inline xmlns:a="http://schemas.openxmlformats.org/drawingml/2006/main" xmlns:pic="http://schemas.openxmlformats.org/drawingml/2006/picture">
-            <wp:extent cx="5806440" cy="3741928"/>
+            <wp:extent cx="5806440" cy="3806444"/>
             <wp:docPr id="5" name="Picture 5" descr="圖 4　AI Assistant Runtime Interaction Architecture" title="圖 4　AI Assistant Runtime Interaction Architecture"/>
             <wp:cNvGraphicFramePr>
               <a:graphicFrameLocks noChangeAspect="1"/>
@@ -1997,7 +1997,7 @@
                   <pic:spPr>
                     <a:xfrm>
                       <a:off x="0" y="0"/>
-                      <a:ext cx="5806440" cy="3741928"/>
+                      <a:ext cx="5806440" cy="3806444"/>
                     </a:xfrm>
                     <a:prstGeom prst="rect"/>
                   </pic:spPr>
@@ -2637,7 +2637,7 @@
           <w:color w:val="111827"/>
           <w:sz w:val="22"/>
         </w:rPr>
-        <w:t>執行 gcloud run deploy --source backend，並掛載 dcka-chatbot-runtime。</w:t>
+        <w:t>執行 gcloud run deploy --source backend，指定 dcka-cloud-build 建置並掛載 dcka-chatbot-runtime。</w:t>
       </w:r>
     </w:p>
     <w:p>
@@ -2650,7 +2650,7 @@
           <w:color w:val="111827"/>
           <w:sz w:val="22"/>
         </w:rPr>
-        <w:t>Cloud Build 依 Dockerfile 建置 image，Artifact Registry 保存 managed artifact。</w:t>
+        <w:t>Cloud Build 以 roles/run.builder 依 Dockerfile 建置 image，Artifact Registry 保存 managed artifact。</w:t>
       </w:r>
     </w:p>
     <w:p>
@@ -2697,7 +2697,7 @@
           <w:color w:val="111827"/>
           <w:sz w:val="22"/>
         </w:rPr>
-        <w:t>Variables：GCP_PROJECT_ID、GCP_WIF_PROVIDER、GCP_DEPLOYER_SA、GCP_RUNTIME_SA。</w:t>
+        <w:t>Variables：GCP_PROJECT_ID、GCP_WIF_PROVIDER、GCP_DEPLOYER_SA、GCP_BUILD_SA、GCP_RUNTIME_SA。</w:t>
       </w:r>
     </w:p>
     <w:p>
@@ -2766,6 +2766,19 @@
       <w:pPr>
         <w:spacing w:after="40"/>
       </w:pPr>
+    </w:p>
+    <w:p>
+      <w:pPr>
+        <w:pStyle w:val="ListBullet"/>
+      </w:pPr>
+      <w:r>
+        <w:rPr>
+          <w:rFonts w:ascii="Calibri" w:hAnsi="Calibri" w:eastAsia="PingFang TC"/>
+          <w:color w:val="111827"/>
+          <w:sz w:val="22"/>
+        </w:rPr>
+        <w:t>dcka-cloud-build 只具備 roles/run.builder；deployer 透過 roles/iam.serviceAccountUser 啟動這個建置身分。</w:t>
+      </w:r>
     </w:p>
     <w:tbl>
       <w:tblPr>

</xml_diff>

<commit_message>
docs: record successful WIF deployment
</commit_message>
<xml_diff>
--- a/project-notes/word/DCKA_網站與AI助教技術架構_安全強化版.docx
+++ b/project-notes/word/DCKA_網站與AI助教技術架構_安全強化版.docx
@@ -2920,7 +2920,7 @@
           <w:color w:val="111827"/>
           <w:sz w:val="22"/>
         </w:rPr>
-        <w:t>驗證日期：2026-08-19（Asia/Taipei）。既有線上問答流程已通過；本輪安全與部署改善已由後端 8 項自動測試及 MkDocs build 驗證，push 後仍需在線上複驗 CORS、rate limit、錯誤與 TTL。</w:t>
+        <w:t>驗證日期：2026-08-19（Asia/Taipei）。本輪安全與部署改善已通過後端 8 項自動測試、MkDocs build、GitHub Pages Action、WIF／Cloud Run 部署、正式 CORS、線上問答、Firestore 落盤與 TTL ACTIVE 驗證。</w:t>
       </w:r>
     </w:p>
     <w:tbl>
@@ -3224,7 +3224,7 @@
                 <w:color w:val="111827"/>
                 <w:sz w:val="18"/>
               </w:rPr>
-              <w:t>HTTP 200；約 3.70 秒</w:t>
+              <w:t>HTTP 200；部署驗證約 1.73 秒</w:t>
             </w:r>
           </w:p>
         </w:tc>
@@ -3821,7 +3821,7 @@
           <w:color w:val="111827"/>
           <w:sz w:val="22"/>
         </w:rPr>
-        <w:t>GitHub Actions Workload Identity Federation 與專用 deployer/runtime service accounts。</w:t>
+        <w:t>GitHub Actions Workload Identity Federation 與專用 deployer/build/runtime service accounts；線上部署已驗證成功。</w:t>
       </w:r>
     </w:p>
     <w:p>
@@ -3894,7 +3894,7 @@
           <w:color w:val="111827"/>
           <w:sz w:val="22"/>
         </w:rPr>
-        <w:t>完成 WIF 部署後的線上安全回歸測試，並逐步移除預設 Compute Service Account 的 Project Editor 權限。</w:t>
+        <w:t>逐步移除預設 Compute Service Account 的 Project Editor 權限；目前 workflow 已不再使用該帳號。</w:t>
       </w:r>
     </w:p>
     <w:p>

</xml_diff>

<commit_message>
feat: move chatbot prompt ownership to backend
</commit_message>
<xml_diff>
--- a/project-notes/word/DCKA_網站與AI助教技術架構_安全強化版.docx
+++ b/project-notes/word/DCKA_網站與AI助教技術架構_安全強化版.docx
@@ -529,7 +529,7 @@
                 <w:color w:val="0B2545"/>
                 <w:sz w:val="22"/>
               </w:rPr>
-              <w:t>Cloud Run 是 stateless public API；畫面對話與匿名 session_id 位於 Browser sessionStorage，問答稽核紀錄則持久化至 Firestore。系統仍未使用向量資料庫，每次問答都會把完整 content.json 放進 System Instruction。</w:t>
+              <w:t>Cloud Run 是 stateless public API；畫面對話與匿名 session_id 位於 Browser sessionStorage，問答稽核紀錄則持久化至 Firestore。System Prompt 已由 Backend 控制；每個 Cloud Run instance 按需快取 content.json 一小時，但仍未使用向量資料庫。</w:t>
             </w:r>
           </w:p>
         </w:tc>
@@ -842,7 +842,7 @@
                 <w:color w:val="111827"/>
                 <w:sz w:val="18"/>
               </w:rPr>
-              <w:t>保存 Browser Session、組合 full-context prompt、渲染回答</w:t>
+              <w:t>保存 Browser Session、傳送問題與 History、渲染回答</w:t>
             </w:r>
           </w:p>
         </w:tc>
@@ -1469,7 +1469,7 @@
           <w:color w:val="111827"/>
           <w:sz w:val="22"/>
         </w:rPr>
-        <w:t>docs/assets/js/chatbot.js：Chatbot UI、History、Prompt 與 API 呼叫。</w:t>
+        <w:t>docs/assets/js/chatbot.js：Chatbot UI、History 與精簡 API Request；不保存 System Prompt。</w:t>
       </w:r>
     </w:p>
     <w:p>
@@ -1482,7 +1482,7 @@
           <w:color w:val="111827"/>
           <w:sz w:val="22"/>
         </w:rPr>
-        <w:t>backend/chat_server.py：請求格式、Gemini client、Firestore logging 與 /api/chat。</w:t>
+        <w:t>backend/chat_server.py：受控 Prompt、教材快取、Gemini client、Firestore logging 與 /api/chat。</w:t>
       </w:r>
     </w:p>
     <w:p>
@@ -2066,7 +2066,7 @@
                 <w:color w:val="166534"/>
                 <w:sz w:val="22"/>
               </w:rPr>
-              <w:t>GEMINI_API_KEY 與 Firestore IAM 只存在 Server side；Browser 不會取得金鑰，也不會直接存取 Firestore。</w:t>
+              <w:t>GEMINI_API_KEY 與 Firestore IAM 只存在 Server side；System Prompt 原始碼仍公開，但執行控制權在 Backend，Browser 無法覆寫，也不會直接存取 Firestore。</w:t>
             </w:r>
           </w:p>
         </w:tc>
@@ -2119,7 +2119,7 @@
           <w:color w:val="111827"/>
           <w:sz w:val="22"/>
         </w:rPr>
-        <w:t>點擊右下角機器人圖示，即可開啟「學習筆記小幫手」。首次開啟時，前端會下載 content.json 並準備全站教材上下文。</w:t>
+        <w:t>點擊右下角機器人圖示，即可開啟「學習筆記小幫手」。前端不再下載教材；使用者送出問題後，由 Backend 按需讀取並快取 content.json。</w:t>
       </w:r>
     </w:p>
     <w:p>
@@ -2273,7 +2273,7 @@
           <w:color w:val="111827"/>
           <w:sz w:val="22"/>
         </w:rPr>
-        <w:t>Browser 從 GitHub Pages 取得網站 assets 與 content.json。</w:t>
+        <w:t>Browser 從 GitHub Pages 取得網站 HTML、CSS 與 JavaScript assets。</w:t>
       </w:r>
     </w:p>
     <w:p>
@@ -2286,7 +2286,7 @@
           <w:color w:val="111827"/>
           <w:sz w:val="22"/>
         </w:rPr>
-        <w:t>教材快取放在 Browser memory；對話歷史與匿名 session_id 放在 sessionStorage。</w:t>
+        <w:t>對話歷史與匿名 session_id 放在 sessionStorage；Browser 不保存教材或 System Prompt。</w:t>
       </w:r>
     </w:p>
     <w:p>
@@ -2299,7 +2299,7 @@
           <w:color w:val="111827"/>
           <w:sz w:val="22"/>
         </w:rPr>
-        <w:t>使用者輸入問題，Browser 組合 session_id、history、message 與 full-context system_instruction。</w:t>
+        <w:t>使用者輸入問題，Browser 只組合 session_id、history 與 message。</w:t>
       </w:r>
     </w:p>
     <w:p>
@@ -2325,7 +2325,20 @@
           <w:color w:val="111827"/>
           <w:sz w:val="22"/>
         </w:rPr>
-        <w:t>FastAPI 驗證 1 MiB Body、ChatRequest 與 rate limit，並將 History 轉換成 google.genai.types.Content。</w:t>
+        <w:t>FastAPI 驗證 1 MiB Body、拒絕額外欄位並套用 rate limit；教材快取不存在或超過一小時時，按需讀取 content.json。</w:t>
+      </w:r>
+    </w:p>
+    <w:p>
+      <w:pPr>
+        <w:pStyle w:val="ListNumber"/>
+      </w:pPr>
+      <w:r>
+        <w:rPr>
+          <w:rFonts w:ascii="Calibri" w:hAnsi="Calibri" w:eastAsia="PingFang TC"/>
+          <w:color w:val="111827"/>
+          <w:sz w:val="22"/>
+        </w:rPr>
+        <w:t>Backend 將固定回答規則、信任邊界與完整教材組成 System Instruction，並將 History 轉換成 google.genai.types.Content。</w:t>
       </w:r>
     </w:p>
     <w:p>
@@ -2419,9 +2432,7 @@
         <w:br/>
         <w:t xml:space="preserve">  "history": [{"role": "user", "parts": [{"text": "什麼是 Docker？"}]}],</w:t>
         <w:br/>
-        <w:t xml:space="preserve">  "message": "Kubernetes 的角色是什麼？",</w:t>
-        <w:br/>
-        <w:t xml:space="preserve">  "system_instruction": "回答規則與全站教材內容"</w:t>
+        <w:t xml:space="preserve">  "message": "Kubernetes 的角色是什麼？"</w:t>
         <w:br/>
         <w:t>}</w:t>
       </w:r>
@@ -2535,7 +2546,7 @@
                 <w:color w:val="0B2545"/>
                 <w:sz w:val="22"/>
               </w:rPr>
-              <w:t>目前是把全站文件直接加入 System Instruction 的 full-context RAG，尚未使用 embedding、vector database 或 top-k retrieval。</w:t>
+              <w:t>Backend 會把全站文件直接加入 System Instruction，仍是 full-context RAG；這次改善 Prompt 控制權與 Browser Request 大小，但 Gemini Token 用量不變。</w:t>
             </w:r>
           </w:p>
         </w:tc>
@@ -2920,7 +2931,7 @@
           <w:color w:val="111827"/>
           <w:sz w:val="22"/>
         </w:rPr>
-        <w:t>驗證日期：2026-08-19（Asia/Taipei）。本輪安全與部署改善已通過後端 8 項自動測試、MkDocs build、GitHub Pages Action、WIF／Cloud Run 部署、正式 CORS、線上問答、Firestore 落盤與 TTL ACTIVE 驗證。</w:t>
+        <w:t>驗證日期：2026-08-19（Asia/Taipei）。安全與 Backend-owned Prompt 已通過後端 13 項自動測試及 MkDocs strict build；既有 GitHub Pages Action、WIF／Cloud Run 部署、正式 CORS、線上問答、Firestore 落盤與 TTL ACTIVE 驗證亦正常。</w:t>
       </w:r>
     </w:p>
     <w:tbl>
@@ -3839,6 +3850,19 @@
     </w:p>
     <w:p>
       <w:pPr>
+        <w:pStyle w:val="ListBullet"/>
+      </w:pPr>
+      <w:r>
+        <w:rPr>
+          <w:rFonts w:ascii="Calibri" w:hAnsi="Calibri" w:eastAsia="PingFang TC"/>
+          <w:color w:val="111827"/>
+          <w:sz w:val="22"/>
+        </w:rPr>
+        <w:t>System Prompt 已移至 Backend；公開 API 拒絕 system_instruction，教材採一小時 instance-local cache 與 stale fallback。</w:t>
+      </w:r>
+    </w:p>
+    <w:p>
+      <w:pPr>
         <w:pStyle w:val="Heading2"/>
       </w:pPr>
       <w:r>

</xml_diff>

<commit_message>
docs: record backend prompt verification
</commit_message>
<xml_diff>
--- a/project-notes/word/DCKA_網站與AI助教技術架構_安全強化版.docx
+++ b/project-notes/word/DCKA_網站與AI助教技術架構_安全強化版.docx
@@ -2931,7 +2931,7 @@
           <w:color w:val="111827"/>
           <w:sz w:val="22"/>
         </w:rPr>
-        <w:t>驗證日期：2026-08-19（Asia/Taipei）。安全與 Backend-owned Prompt 已通過後端 13 項自動測試及 MkDocs strict build；既有 GitHub Pages Action、WIF／Cloud Run 部署、正式 CORS、線上問答、Firestore 落盤與 TTL ACTIVE 驗證亦正常。</w:t>
+        <w:t>驗證日期：2026-08-19（Asia/Taipei）。安全與 Backend-owned Prompt 已通過後端 13 項自動測試及 MkDocs strict build；GitHub Pages Action、WIF／Cloud Run revision dcka-chatbot-backend-00007-p7b、正式 CORS、Prompt 拒絕覆寫、教材快取、線上問答、Firestore 落盤與 TTL ACTIVE 驗證亦正常。</w:t>
       </w:r>
     </w:p>
     <w:tbl>
@@ -3235,7 +3235,7 @@
                 <w:color w:val="111827"/>
                 <w:sz w:val="18"/>
               </w:rPr>
-              <w:t>HTTP 200；部署驗證約 1.73 秒</w:t>
+              <w:t>HTTP 200；首次約 5.60 秒、快取命中約 3.30 秒</w:t>
             </w:r>
           </w:p>
         </w:tc>
@@ -3260,7 +3260,161 @@
                 <w:color w:val="166534"/>
                 <w:sz w:val="18"/>
               </w:rPr>
-              <w:t>通過</w:t>
+              <w:t>線上通過</w:t>
+            </w:r>
+          </w:p>
+        </w:tc>
+      </w:tr>
+      <w:tr>
+        <w:tc>
+          <w:tcPr>
+            <w:tcW w:type="dxa" w:w="2600"/>
+            <w:tcMar>
+              <w:top w:w="80" w:type="dxa"/>
+              <w:start w:w="120" w:type="dxa"/>
+              <w:bottom w:w="80" w:type="dxa"/>
+              <w:end w:w="120" w:type="dxa"/>
+            </w:tcMar>
+          </w:tcPr>
+          <w:p>
+            <w:pPr>
+              <w:jc w:val="left"/>
+            </w:pPr>
+            <w:r>
+              <w:rPr>
+                <w:rFonts w:ascii="Calibri" w:hAnsi="Calibri" w:eastAsia="PingFang TC"/>
+                <w:b w:val="0"/>
+                <w:color w:val="111827"/>
+                <w:sz w:val="18"/>
+              </w:rPr>
+              <w:t>Prompt Ownership</w:t>
+            </w:r>
+          </w:p>
+        </w:tc>
+        <w:tc>
+          <w:tcPr>
+            <w:tcW w:type="dxa" w:w="4960"/>
+            <w:tcMar>
+              <w:top w:w="80" w:type="dxa"/>
+              <w:start w:w="120" w:type="dxa"/>
+              <w:bottom w:w="80" w:type="dxa"/>
+              <w:end w:w="120" w:type="dxa"/>
+            </w:tcMar>
+          </w:tcPr>
+          <w:p>
+            <w:pPr>
+              <w:jc w:val="left"/>
+            </w:pPr>
+            <w:r>
+              <w:rPr>
+                <w:rFonts w:ascii="Calibri" w:hAnsi="Calibri" w:eastAsia="PingFang TC"/>
+                <w:b w:val="0"/>
+                <w:color w:val="111827"/>
+                <w:sz w:val="18"/>
+              </w:rPr>
+              <w:t>Browser 不傳 Prompt；夾帶 system_instruction 時 HTTP 422</w:t>
+            </w:r>
+          </w:p>
+        </w:tc>
+        <w:tc>
+          <w:tcPr>
+            <w:tcW w:type="dxa" w:w="1800"/>
+            <w:tcMar>
+              <w:top w:w="80" w:type="dxa"/>
+              <w:start w:w="120" w:type="dxa"/>
+              <w:bottom w:w="80" w:type="dxa"/>
+              <w:end w:w="120" w:type="dxa"/>
+            </w:tcMar>
+          </w:tcPr>
+          <w:p>
+            <w:pPr>
+              <w:jc w:val="center"/>
+            </w:pPr>
+            <w:r>
+              <w:rPr>
+                <w:rFonts w:ascii="Calibri" w:hAnsi="Calibri" w:eastAsia="PingFang TC"/>
+                <w:b/>
+                <w:color w:val="166534"/>
+                <w:sz w:val="18"/>
+              </w:rPr>
+              <w:t>線上通過</w:t>
+            </w:r>
+          </w:p>
+        </w:tc>
+      </w:tr>
+      <w:tr>
+        <w:tc>
+          <w:tcPr>
+            <w:tcW w:type="dxa" w:w="2600"/>
+            <w:tcMar>
+              <w:top w:w="80" w:type="dxa"/>
+              <w:start w:w="120" w:type="dxa"/>
+              <w:bottom w:w="80" w:type="dxa"/>
+              <w:end w:w="120" w:type="dxa"/>
+            </w:tcMar>
+          </w:tcPr>
+          <w:p>
+            <w:pPr>
+              <w:jc w:val="left"/>
+            </w:pPr>
+            <w:r>
+              <w:rPr>
+                <w:rFonts w:ascii="Calibri" w:hAnsi="Calibri" w:eastAsia="PingFang TC"/>
+                <w:b w:val="0"/>
+                <w:color w:val="111827"/>
+                <w:sz w:val="18"/>
+              </w:rPr>
+              <w:t>教材 Cache</w:t>
+            </w:r>
+          </w:p>
+        </w:tc>
+        <w:tc>
+          <w:tcPr>
+            <w:tcW w:type="dxa" w:w="4960"/>
+            <w:tcMar>
+              <w:top w:w="80" w:type="dxa"/>
+              <w:start w:w="120" w:type="dxa"/>
+              <w:bottom w:w="80" w:type="dxa"/>
+              <w:end w:w="120" w:type="dxa"/>
+            </w:tcMar>
+          </w:tcPr>
+          <w:p>
+            <w:pPr>
+              <w:jc w:val="left"/>
+            </w:pPr>
+            <w:r>
+              <w:rPr>
+                <w:rFonts w:ascii="Calibri" w:hAnsi="Calibri" w:eastAsia="PingFang TC"/>
+                <w:b w:val="0"/>
+                <w:color w:val="111827"/>
+                <w:sz w:val="18"/>
+              </w:rPr>
+              <w:t>Cloud Logging 僅一次 refresh；第二次請求沿用一小時快取</w:t>
+            </w:r>
+          </w:p>
+        </w:tc>
+        <w:tc>
+          <w:tcPr>
+            <w:tcW w:type="dxa" w:w="1800"/>
+            <w:tcMar>
+              <w:top w:w="80" w:type="dxa"/>
+              <w:start w:w="120" w:type="dxa"/>
+              <w:bottom w:w="80" w:type="dxa"/>
+              <w:end w:w="120" w:type="dxa"/>
+            </w:tcMar>
+          </w:tcPr>
+          <w:p>
+            <w:pPr>
+              <w:jc w:val="center"/>
+            </w:pPr>
+            <w:r>
+              <w:rPr>
+                <w:rFonts w:ascii="Calibri" w:hAnsi="Calibri" w:eastAsia="PingFang TC"/>
+                <w:b/>
+                <w:color w:val="166534"/>
+                <w:sz w:val="18"/>
+              </w:rPr>
+              <w:t>線上通過</w:t>
             </w:r>
           </w:p>
         </w:tc>
@@ -3312,7 +3466,7 @@
                 <w:color w:val="111827"/>
                 <w:sz w:val="18"/>
               </w:rPr>
-              <w:t>只允許 GitHub Pages 與 localhost；本機測試通過</w:t>
+              <w:t>只允許 GitHub Pages 與 localhost；正式 Origin 線上通過</w:t>
             </w:r>
           </w:p>
         </w:tc>
@@ -3337,7 +3491,7 @@
                 <w:color w:val="166534"/>
                 <w:sz w:val="18"/>
               </w:rPr>
-              <w:t>本機通過</w:t>
+              <w:t>線上通過</w:t>
             </w:r>
           </w:p>
         </w:tc>
@@ -3620,7 +3774,7 @@
                 <w:color w:val="111827"/>
                 <w:sz w:val="18"/>
               </w:rPr>
-              <w:t>遮罩、expires_at 與 background write 自動測試通過</w:t>
+              <w:t>兩筆問答、模型、延遲、狀態與 expires_at 正確落盤</w:t>
             </w:r>
           </w:p>
         </w:tc>
@@ -3645,7 +3799,7 @@
                 <w:color w:val="166534"/>
                 <w:sz w:val="18"/>
               </w:rPr>
-              <w:t>本機通過</w:t>
+              <w:t>線上通過</w:t>
             </w:r>
           </w:p>
         </w:tc>

</xml_diff>